<commit_message>
Revert "feat(model) : Modification des valeurs autorisées pour le champ vehicleType du message RC-RI"
</commit_message>
<xml_diff>
--- a/csv_parser/out/RC-RI/RC-RI.schema.docx
+++ b/csv_parser/out/RC-RI/RC-RI.schema.docx
@@ -793,7 +793,7 @@
             <w:r>
               <w:t>string</w:t>
               <w:br/>
-              <w:t>(ENUM: VECTEUR_SANTE, SIS)</w:t>
+              <w:t>(ENUM: SMUR, SIS)</w:t>
             </w:r>
           </w:p>
         </w:tc>
@@ -823,7 +823,7 @@
           </w:tcPr>
           <w:p>
             <w:r>
-              <w:t>VECTEUR_SANTE</w:t>
+              <w:t>SMUR</w:t>
             </w:r>
           </w:p>
         </w:tc>

</xml_diff>